<commit_message>
Summary tiles: short values, qualifiers in labels, US-style units
Co-Authored-By: Claude Opus 5.5 <noreply@anthropic.com>
Claude-Session: https://claude.ai/code/session_01ChEN58PbdXFZmwUoBZYBRb
</commit_message>
<xml_diff>
--- a/output/India_Summary_DRAFT.docx
+++ b/output/India_Summary_DRAFT.docx
@@ -128,9 +128,9 @@
               <w:rPr>
                 <w:b/>
                 <w:color w:val="0B0B0B"/>
-                <w:sz w:val="40"/>
+                <w:sz w:val="36"/>
               </w:rPr>
-              <w:t>About 1.46 billion</w:t>
+              <w:t>1.46 bn</w:t>
             </w:r>
           </w:p>
           <w:p>
@@ -168,9 +168,9 @@
               <w:rPr>
                 <w:b/>
                 <w:color w:val="0B0B0B"/>
-                <w:sz w:val="40"/>
+                <w:sz w:val="36"/>
               </w:rPr>
-              <w:t>About $11,748</w:t>
+              <w:t>$11,748</w:t>
             </w:r>
           </w:p>
           <w:p>
@@ -182,7 +182,7 @@
                 <w:color w:val="52514E"/>
                 <w:sz w:val="17"/>
               </w:rPr>
-              <w:t>GDP per capita (PPP), 2025</w:t>
+              <w:t>GDP per capita (PPP), about, 2025</w:t>
             </w:r>
             <w:hyperlink r:id="rId12">
               <w:r>
@@ -208,7 +208,7 @@
               <w:rPr>
                 <w:b/>
                 <w:color w:val="0B0B0B"/>
-                <w:sz w:val="40"/>
+                <w:sz w:val="36"/>
               </w:rPr>
               <w:t>3.37%</w:t>
             </w:r>
@@ -248,7 +248,7 @@
               <w:rPr>
                 <w:b/>
                 <w:color w:val="0B0B0B"/>
-                <w:sz w:val="40"/>
+                <w:sz w:val="36"/>
               </w:rPr>
               <w:t>43.4%</w:t>
             </w:r>
@@ -290,9 +290,9 @@
               <w:rPr>
                 <w:b/>
                 <w:color w:val="0B0B0B"/>
-                <w:sz w:val="40"/>
+                <w:sz w:val="36"/>
               </w:rPr>
-              <w:t>About 0.95</w:t>
+              <w:t>0.95</w:t>
             </w:r>
           </w:p>
           <w:p>
@@ -304,7 +304,7 @@
                 <w:color w:val="52514E"/>
                 <w:sz w:val="17"/>
               </w:rPr>
-              <w:t>Registered doctors per 1,000, 2025</w:t>
+              <w:t>Registered doctors per 1,000, about, 2025</w:t>
             </w:r>
             <w:hyperlink r:id="rId15">
               <w:r>
@@ -330,9 +330,9 @@
               <w:rPr>
                 <w:b/>
                 <w:color w:val="0B0B0B"/>
-                <w:sz w:val="40"/>
+                <w:sz w:val="36"/>
               </w:rPr>
-              <w:t>13.25 crore</w:t>
+              <w:t>132.5 m</w:t>
             </w:r>
           </w:p>
           <w:p>
@@ -344,7 +344,7 @@
                 <w:color w:val="52514E"/>
                 <w:sz w:val="17"/>
               </w:rPr>
-              <w:t>PM-JAY admissions in 8 years, to 2026</w:t>
+              <w:t>PM-JAY admissions funded, 8 years to 2026</w:t>
             </w:r>
             <w:hyperlink r:id="rId16">
               <w:r>
@@ -370,7 +370,7 @@
               <w:rPr>
                 <w:b/>
                 <w:color w:val="0B0B0B"/>
-                <w:sz w:val="40"/>
+                <w:sz w:val="36"/>
               </w:rPr>
               <w:t>64.6%</w:t>
             </w:r>
@@ -410,9 +410,9 @@
               <w:rPr>
                 <w:b/>
                 <w:color w:val="0B0B0B"/>
-                <w:sz w:val="40"/>
+                <w:sz w:val="36"/>
               </w:rPr>
-              <w:t>6.44 lakh</w:t>
+              <w:t>644,000</w:t>
             </w:r>
           </w:p>
           <w:p>

</xml_diff>

<commit_message>
Summary: add verified country background paragraph to At a Glance
Co-Authored-By: Claude Opus 5.5 <noreply@anthropic.com>
Claude-Session: https://claude.ai/code/session_01ChEN58PbdXFZmwUoBZYBRb
</commit_message>
<xml_diff>
--- a/output/India_Summary_DRAFT.docx
+++ b/output/India_Summary_DRAFT.docx
@@ -449,6 +449,192 @@
           <w:color w:val="B31822"/>
           <w:sz w:val="24"/>
         </w:rPr>
+        <w:t>Country background</w:t>
+      </w:r>
+    </w:p>
+    <w:p>
+      <w:r>
+        <w:rPr>
+          <w:sz w:val="21"/>
+        </w:rPr>
+        <w:t>India, with about 1.46 billion people in 2025, is a federal parliamentary democratic republic with its capital in New Delhi.</w:t>
+      </w:r>
+      <w:hyperlink r:id="rId11">
+        <w:r>
+          <w:rPr>
+            <w:color w:val="B31822"/>
+            <w:vertAlign w:val="superscript"/>
+          </w:rPr>
+          <w:t xml:space="preserve">3</w:t>
+        </w:r>
+      </w:hyperlink>
+      <w:hyperlink r:id="rId19">
+        <w:r>
+          <w:rPr>
+            <w:color w:val="B31822"/>
+            <w:vertAlign w:val="superscript"/>
+          </w:rPr>
+          <w:t xml:space="preserve">1</w:t>
+        </w:r>
+      </w:hyperlink>
+      <w:hyperlink r:id="rId20">
+        <w:r>
+          <w:rPr>
+            <w:color w:val="B31822"/>
+            <w:vertAlign w:val="superscript"/>
+          </w:rPr>
+          <w:t xml:space="preserve">2</w:t>
+        </w:r>
+      </w:hyperlink>
+      <w:r>
+        <w:rPr>
+          <w:sz w:val="21"/>
+        </w:rPr>
+        <w:t xml:space="preserve"> President Droupadi Murmu is head of state, and Prime Minister Narendra Modi, in office since 2014, began a third term in June 2024.</w:t>
+      </w:r>
+      <w:hyperlink r:id="rId21">
+        <w:r>
+          <w:rPr>
+            <w:color w:val="B31822"/>
+            <w:vertAlign w:val="superscript"/>
+          </w:rPr>
+          <w:t xml:space="preserve">8</w:t>
+        </w:r>
+      </w:hyperlink>
+      <w:hyperlink r:id="rId22">
+        <w:r>
+          <w:rPr>
+            <w:color w:val="B31822"/>
+            <w:vertAlign w:val="superscript"/>
+          </w:rPr>
+          <w:t xml:space="preserve">9</w:t>
+        </w:r>
+      </w:hyperlink>
+      <w:r>
+        <w:rPr>
+          <w:sz w:val="21"/>
+        </w:rPr>
+        <w:t xml:space="preserve"> Health care delivery is a state responsibility under the Constitution, and a state government is often the counterparty for a foreign partner.</w:t>
+      </w:r>
+      <w:hyperlink r:id="rId20">
+        <w:r>
+          <w:rPr>
+            <w:color w:val="B31822"/>
+            <w:vertAlign w:val="superscript"/>
+          </w:rPr>
+          <w:t xml:space="preserve">2</w:t>
+        </w:r>
+      </w:hyperlink>
+      <w:hyperlink r:id="rId23">
+        <w:r>
+          <w:rPr>
+            <w:color w:val="B31822"/>
+            <w:vertAlign w:val="superscript"/>
+          </w:rPr>
+          <w:t xml:space="preserve">24</w:t>
+        </w:r>
+      </w:hyperlink>
+      <w:r>
+        <w:rPr>
+          <w:sz w:val="21"/>
+        </w:rPr>
+        <w:t xml:space="preserve"> The IMF counts India among the fastest-growing major economies: official provisional estimates put real GDP growth at 7.7 percent in FY2025-26, and the World Bank puts 2025 GDP at about US$17.2 trillion in purchasing-power terms.</w:t>
+      </w:r>
+      <w:hyperlink r:id="rId24">
+        <w:r>
+          <w:rPr>
+            <w:color w:val="B31822"/>
+            <w:vertAlign w:val="superscript"/>
+          </w:rPr>
+          <w:t xml:space="preserve">25</w:t>
+        </w:r>
+      </w:hyperlink>
+      <w:hyperlink r:id="rId25">
+        <w:r>
+          <w:rPr>
+            <w:color w:val="B31822"/>
+            <w:vertAlign w:val="superscript"/>
+          </w:rPr>
+          <w:t xml:space="preserve">26</w:t>
+        </w:r>
+      </w:hyperlink>
+      <w:hyperlink r:id="rId26">
+        <w:r>
+          <w:rPr>
+            <w:color w:val="B31822"/>
+            <w:vertAlign w:val="superscript"/>
+          </w:rPr>
+          <w:t xml:space="preserve">5</w:t>
+        </w:r>
+      </w:hyperlink>
+      <w:r>
+        <w:rPr>
+          <w:sz w:val="21"/>
+        </w:rPr>
+        <w:t xml:space="preserve"> The population is aging: fertility fell to 1.9 in 2024, below replacement, and UNFPA projects the share aged 60 and over to rise from 10.5 percent in 2022 to 20.8 percent by 2050.</w:t>
+      </w:r>
+      <w:hyperlink r:id="rId27">
+        <w:r>
+          <w:rPr>
+            <w:color w:val="B31822"/>
+            <w:vertAlign w:val="superscript"/>
+          </w:rPr>
+          <w:t xml:space="preserve">12</w:t>
+        </w:r>
+      </w:hyperlink>
+      <w:hyperlink r:id="rId28">
+        <w:r>
+          <w:rPr>
+            <w:color w:val="B31822"/>
+            <w:vertAlign w:val="superscript"/>
+          </w:rPr>
+          <w:t xml:space="preserve">15</w:t>
+        </w:r>
+      </w:hyperlink>
+      <w:hyperlink r:id="rId29">
+        <w:r>
+          <w:rPr>
+            <w:color w:val="B31822"/>
+            <w:vertAlign w:val="superscript"/>
+          </w:rPr>
+          <w:t xml:space="preserve">16</w:t>
+        </w:r>
+      </w:hyperlink>
+      <w:r>
+        <w:rPr>
+          <w:sz w:val="21"/>
+        </w:rPr>
+        <w:t xml:space="preserve"> US trade policy is a risk: most Indian goods have faced a 10 percent US duty since 24 July 2026.</w:t>
+      </w:r>
+      <w:hyperlink r:id="rId30">
+        <w:r>
+          <w:rPr>
+            <w:color w:val="B31822"/>
+            <w:vertAlign w:val="superscript"/>
+          </w:rPr>
+          <w:t xml:space="preserve">29</w:t>
+        </w:r>
+      </w:hyperlink>
+      <w:hyperlink r:id="rId31">
+        <w:r>
+          <w:rPr>
+            <w:color w:val="B31822"/>
+            <w:vertAlign w:val="superscript"/>
+          </w:rPr>
+          <w:t xml:space="preserve">30</w:t>
+        </w:r>
+      </w:hyperlink>
+    </w:p>
+    <w:p>
+      <w:pPr>
+        <w:spacing w:before="160" w:after="60"/>
+      </w:pPr>
+      <w:r>
+        <w:rPr>
+          <w:b/>
+          <w:color w:val="B31822"/>
+          <w:sz w:val="24"/>
+        </w:rPr>
         <w:t>Key takeaways for CSI</w:t>
       </w:r>
     </w:p>
@@ -463,7 +649,7 @@
         </w:rPr>
         <w:t>Two-tier market: PM-JAY rates anchor mass care; a smaller paying and international segment sustains premium care.</w:t>
       </w:r>
-      <w:hyperlink r:id="rId19">
+      <w:hyperlink r:id="rId32">
         <w:r>
           <w:rPr>
             <w:color w:val="B31822"/>
@@ -493,7 +679,7 @@
         </w:rPr>
         <w:t>Mount Sinai's exclusive Ramaiah collaboration, reportedly 10 years, is CSI's closest peer model.</w:t>
       </w:r>
-      <w:hyperlink r:id="rId20">
+      <w:hyperlink r:id="rId33">
         <w:r>
           <w:rPr>
             <w:color w:val="B31822"/>
@@ -502,7 +688,7 @@
           <w:t xml:space="preserve">122</w:t>
         </w:r>
       </w:hyperlink>
-      <w:hyperlink r:id="rId21">
+      <w:hyperlink r:id="rId34">
         <w:r>
           <w:rPr>
             <w:color w:val="B31822"/>
@@ -523,7 +709,7 @@
         </w:rPr>
         <w:t>Private chains are the likeliest commercial partners; state governments are often the counterparty.</w:t>
       </w:r>
-      <w:hyperlink r:id="rId22">
+      <w:hyperlink r:id="rId35">
         <w:r>
           <w:rPr>
             <w:color w:val="B31822"/>
@@ -562,7 +748,7 @@
           <w:t xml:space="preserve">80</w:t>
         </w:r>
       </w:hyperlink>
-      <w:hyperlink r:id="rId24">
+      <w:hyperlink r:id="rId36">
         <w:r>
           <w:rPr>
             <w:color w:val="B31822"/>
@@ -605,7 +791,7 @@
         </w:rPr>
         <w:t>States run delivery, from 1,81,873 Ayushman Arogya Mandirs to AIIMS and Tata Memorial Centre.</w:t>
       </w:r>
-      <w:hyperlink r:id="rId25">
+      <w:hyperlink r:id="rId20">
         <w:r>
           <w:rPr>
             <w:color w:val="B31822"/>
@@ -614,7 +800,7 @@
           <w:t xml:space="preserve">2</w:t>
         </w:r>
       </w:hyperlink>
-      <w:hyperlink r:id="rId26">
+      <w:hyperlink r:id="rId37">
         <w:r>
           <w:rPr>
             <w:color w:val="B31822"/>
@@ -644,7 +830,7 @@
           <w:t xml:space="preserve">23</w:t>
         </w:r>
       </w:hyperlink>
-      <w:hyperlink r:id="rId27">
+      <w:hyperlink r:id="rId38">
         <w:r>
           <w:rPr>
             <w:color w:val="B31822"/>
@@ -674,7 +860,7 @@
           <w:t xml:space="preserve">80</w:t>
         </w:r>
       </w:hyperlink>
-      <w:hyperlink r:id="rId28">
+      <w:hyperlink r:id="rId39">
         <w:r>
           <w:rPr>
             <w:color w:val="B31822"/>
@@ -683,7 +869,7 @@
           <w:t xml:space="preserve">55</w:t>
         </w:r>
       </w:hyperlink>
-      <w:hyperlink r:id="rId29">
+      <w:hyperlink r:id="rId40">
         <w:r>
           <w:rPr>
             <w:color w:val="B31822"/>
@@ -722,7 +908,7 @@
                     <pic:cNvPicPr/>
                   </pic:nvPicPr>
                   <pic:blipFill>
-                    <a:blip r:embed="rId30"/>
+                    <a:blip r:embed="rId41"/>
                     <a:stretch>
                       <a:fillRect/>
                     </a:stretch>
@@ -761,7 +947,7 @@
           <w:t xml:space="preserve">76,</w:t>
         </w:r>
       </w:hyperlink>
-      <w:hyperlink r:id="rId31">
+      <w:hyperlink r:id="rId42">
         <w:r>
           <w:rPr>
             <w:color w:val="B31822"/>
@@ -800,7 +986,7 @@
                     <pic:cNvPicPr/>
                   </pic:nvPicPr>
                   <pic:blipFill>
-                    <a:blip r:embed="rId32"/>
+                    <a:blip r:embed="rId43"/>
                     <a:stretch>
                       <a:fillRect/>
                     </a:stretch>
@@ -848,7 +1034,7 @@
           <w:t xml:space="preserve">3,</w:t>
         </w:r>
       </w:hyperlink>
-      <w:hyperlink r:id="rId24">
+      <w:hyperlink r:id="rId36">
         <w:r>
           <w:rPr>
             <w:color w:val="B31822"/>
@@ -857,7 +1043,7 @@
           <w:t xml:space="preserve">83,</w:t>
         </w:r>
       </w:hyperlink>
-      <w:hyperlink r:id="rId33">
+      <w:hyperlink r:id="rId44">
         <w:r>
           <w:rPr>
             <w:color w:val="B31822"/>
@@ -866,7 +1052,7 @@
           <w:t xml:space="preserve">84,</w:t>
         </w:r>
       </w:hyperlink>
-      <w:hyperlink r:id="rId28">
+      <w:hyperlink r:id="rId39">
         <w:r>
           <w:rPr>
             <w:color w:val="B31822"/>
@@ -875,7 +1061,7 @@
           <w:t xml:space="preserve">55,</w:t>
         </w:r>
       </w:hyperlink>
-      <w:hyperlink r:id="rId34">
+      <w:hyperlink r:id="rId45">
         <w:r>
           <w:rPr>
             <w:color w:val="B31822"/>
@@ -884,7 +1070,7 @@
           <w:t xml:space="preserve">86,</w:t>
         </w:r>
       </w:hyperlink>
-      <w:hyperlink r:id="rId35">
+      <w:hyperlink r:id="rId46">
         <w:r>
           <w:rPr>
             <w:color w:val="B31822"/>
@@ -893,7 +1079,7 @@
           <w:t xml:space="preserve">87,</w:t>
         </w:r>
       </w:hyperlink>
-      <w:hyperlink r:id="rId36">
+      <w:hyperlink r:id="rId47">
         <w:r>
           <w:rPr>
             <w:color w:val="B31822"/>
@@ -936,7 +1122,7 @@
         </w:rPr>
         <w:t>Manipal (13,037 licensed beds), Apollo (10,970, including overseas) and Aster DM Quality Care (over 10,600) lead.</w:t>
       </w:r>
-      <w:hyperlink r:id="rId37">
+      <w:hyperlink r:id="rId48">
         <w:r>
           <w:rPr>
             <w:color w:val="B31822"/>
@@ -945,7 +1131,7 @@
           <w:t xml:space="preserve">62</w:t>
         </w:r>
       </w:hyperlink>
-      <w:hyperlink r:id="rId38">
+      <w:hyperlink r:id="rId49">
         <w:r>
           <w:rPr>
             <w:color w:val="B31822"/>
@@ -954,7 +1140,7 @@
           <w:t xml:space="preserve">64</w:t>
         </w:r>
       </w:hyperlink>
-      <w:hyperlink r:id="rId39">
+      <w:hyperlink r:id="rId50">
         <w:r>
           <w:rPr>
             <w:color w:val="B31822"/>
@@ -975,7 +1161,7 @@
         </w:rPr>
         <w:t>Capital: Manipal's Rs 9,275 crore IPO, Blackstone in Aster, KKR's pending Medicover deal, IHH controlling Fortis.</w:t>
       </w:r>
-      <w:hyperlink r:id="rId40">
+      <w:hyperlink r:id="rId51">
         <w:r>
           <w:rPr>
             <w:color w:val="B31822"/>
@@ -984,7 +1170,7 @@
           <w:t xml:space="preserve">63</w:t>
         </w:r>
       </w:hyperlink>
-      <w:hyperlink r:id="rId41">
+      <w:hyperlink r:id="rId52">
         <w:r>
           <w:rPr>
             <w:color w:val="B31822"/>
@@ -993,7 +1179,7 @@
           <w:t xml:space="preserve">66</w:t>
         </w:r>
       </w:hyperlink>
-      <w:hyperlink r:id="rId42">
+      <w:hyperlink r:id="rId53">
         <w:r>
           <w:rPr>
             <w:color w:val="B31822"/>
@@ -1002,7 +1188,7 @@
           <w:t xml:space="preserve">74</w:t>
         </w:r>
       </w:hyperlink>
-      <w:hyperlink r:id="rId43">
+      <w:hyperlink r:id="rId54">
         <w:r>
           <w:rPr>
             <w:color w:val="B31822"/>
@@ -1023,7 +1209,7 @@
         </w:rPr>
         <w:t>Cleveland Clinic anchors Navi Mumbai MediCity under an MoU; Mayo advises Adani's two Health Cities.</w:t>
       </w:r>
-      <w:hyperlink r:id="rId44">
+      <w:hyperlink r:id="rId55">
         <w:r>
           <w:rPr>
             <w:color w:val="B31822"/>
@@ -1032,7 +1218,7 @@
           <w:t xml:space="preserve">103</w:t>
         </w:r>
       </w:hyperlink>
-      <w:hyperlink r:id="rId45">
+      <w:hyperlink r:id="rId56">
         <w:r>
           <w:rPr>
             <w:color w:val="B31822"/>
@@ -1071,7 +1257,7 @@
                     <pic:cNvPicPr/>
                   </pic:nvPicPr>
                   <pic:blipFill>
-                    <a:blip r:embed="rId46"/>
+                    <a:blip r:embed="rId57"/>
                     <a:stretch>
                       <a:fillRect/>
                     </a:stretch>
@@ -1101,7 +1287,7 @@
         </w:rPr>
         <w:t xml:space="preserve">Definitions differ: Manipal licensed beds and Max operational beds (31 March 2026); *Apollo includes managed and overseas hospitals and day-surgery units (March 2026); Aster DM Quality Care after its July 2026 merger; Medicover India is being acquired by KKR. Sources: </w:t>
       </w:r>
-      <w:hyperlink r:id="rId37">
+      <w:hyperlink r:id="rId48">
         <w:r>
           <w:rPr>
             <w:color w:val="B31822"/>
@@ -1110,7 +1296,7 @@
           <w:t xml:space="preserve">62,</w:t>
         </w:r>
       </w:hyperlink>
-      <w:hyperlink r:id="rId40">
+      <w:hyperlink r:id="rId51">
         <w:r>
           <w:rPr>
             <w:color w:val="B31822"/>
@@ -1119,7 +1305,7 @@
           <w:t xml:space="preserve">63,</w:t>
         </w:r>
       </w:hyperlink>
-      <w:hyperlink r:id="rId38">
+      <w:hyperlink r:id="rId49">
         <w:r>
           <w:rPr>
             <w:color w:val="B31822"/>
@@ -1128,7 +1314,7 @@
           <w:t xml:space="preserve">64,</w:t>
         </w:r>
       </w:hyperlink>
-      <w:hyperlink r:id="rId47">
+      <w:hyperlink r:id="rId58">
         <w:r>
           <w:rPr>
             <w:color w:val="B31822"/>
@@ -1137,7 +1323,7 @@
           <w:t xml:space="preserve">65,</w:t>
         </w:r>
       </w:hyperlink>
-      <w:hyperlink r:id="rId41">
+      <w:hyperlink r:id="rId52">
         <w:r>
           <w:rPr>
             <w:color w:val="B31822"/>
@@ -1146,7 +1332,7 @@
           <w:t xml:space="preserve">66,</w:t>
         </w:r>
       </w:hyperlink>
-      <w:hyperlink r:id="rId39">
+      <w:hyperlink r:id="rId50">
         <w:r>
           <w:rPr>
             <w:color w:val="B31822"/>
@@ -1155,7 +1341,7 @@
           <w:t xml:space="preserve">67,</w:t>
         </w:r>
       </w:hyperlink>
-      <w:hyperlink r:id="rId48">
+      <w:hyperlink r:id="rId59">
         <w:r>
           <w:rPr>
             <w:color w:val="B31822"/>
@@ -1164,7 +1350,7 @@
           <w:t xml:space="preserve">68,</w:t>
         </w:r>
       </w:hyperlink>
-      <w:hyperlink r:id="rId49">
+      <w:hyperlink r:id="rId60">
         <w:r>
           <w:rPr>
             <w:color w:val="B31822"/>
@@ -1173,7 +1359,7 @@
           <w:t xml:space="preserve">69,</w:t>
         </w:r>
       </w:hyperlink>
-      <w:hyperlink r:id="rId50">
+      <w:hyperlink r:id="rId61">
         <w:r>
           <w:rPr>
             <w:color w:val="B31822"/>
@@ -1182,7 +1368,7 @@
           <w:t xml:space="preserve">70,</w:t>
         </w:r>
       </w:hyperlink>
-      <w:hyperlink r:id="rId42">
+      <w:hyperlink r:id="rId53">
         <w:r>
           <w:rPr>
             <w:color w:val="B31822"/>
@@ -1191,7 +1377,7 @@
           <w:t xml:space="preserve">74,</w:t>
         </w:r>
       </w:hyperlink>
-      <w:hyperlink r:id="rId51">
+      <w:hyperlink r:id="rId62">
         <w:r>
           <w:rPr>
             <w:color w:val="B31822"/>
@@ -1824,7 +2010,7 @@
         </w:rPr>
         <w:t>Nursing, fellowship and allied-health training, backing budget plans for 1 lakh more allied health professionals.</w:t>
       </w:r>
-      <w:hyperlink r:id="rId24">
+      <w:hyperlink r:id="rId36">
         <w:r>
           <w:rPr>
             <w:color w:val="B31822"/>
@@ -1833,7 +2019,7 @@
           <w:t xml:space="preserve">83</w:t>
         </w:r>
       </w:hyperlink>
-      <w:hyperlink r:id="rId52">
+      <w:hyperlink r:id="rId63">
         <w:r>
           <w:rPr>
             <w:color w:val="B31822"/>
@@ -1854,7 +2040,7 @@
         </w:rPr>
         <w:t>Affiliations, second-opinion services and clinical program development with corporate hospital chains.</w:t>
       </w:r>
-      <w:hyperlink r:id="rId37">
+      <w:hyperlink r:id="rId48">
         <w:r>
           <w:rPr>
             <w:color w:val="B31822"/>
@@ -1863,7 +2049,7 @@
           <w:t xml:space="preserve">62</w:t>
         </w:r>
       </w:hyperlink>
-      <w:hyperlink r:id="rId22">
+      <w:hyperlink r:id="rId35">
         <w:r>
           <w:rPr>
             <w:color w:val="B31822"/>
@@ -1884,7 +2070,7 @@
         </w:rPr>
         <w:t>Cardiology, oncology, metabolic and transplant care in the aging south, west and National Capital Region.</w:t>
       </w:r>
-      <w:hyperlink r:id="rId53">
+      <w:hyperlink r:id="rId28">
         <w:r>
           <w:rPr>
             <w:color w:val="B31822"/>
@@ -1893,7 +2079,7 @@
           <w:t xml:space="preserve">15</w:t>
         </w:r>
       </w:hyperlink>
-      <w:hyperlink r:id="rId54">
+      <w:hyperlink r:id="rId64">
         <w:r>
           <w:rPr>
             <w:color w:val="B31822"/>
@@ -1902,7 +2088,7 @@
           <w:t xml:space="preserve">37</w:t>
         </w:r>
       </w:hyperlink>
-      <w:hyperlink r:id="rId55">
+      <w:hyperlink r:id="rId65">
         <w:r>
           <w:rPr>
             <w:color w:val="B31822"/>
@@ -1945,7 +2131,7 @@
           <w:t xml:space="preserve">104</w:t>
         </w:r>
       </w:hyperlink>
-      <w:hyperlink r:id="rId56">
+      <w:hyperlink r:id="rId66">
         <w:r>
           <w:rPr>
             <w:color w:val="B31822"/>
@@ -1966,7 +2152,7 @@
         </w:rPr>
         <w:t>A 2026 US law allows tariffs up to 100% on the largest Russian energy buyers; generics face Section 232 review.</w:t>
       </w:r>
-      <w:hyperlink r:id="rId57">
+      <w:hyperlink r:id="rId67">
         <w:r>
           <w:rPr>
             <w:color w:val="B31822"/>
@@ -1975,7 +2161,7 @@
           <w:t xml:space="preserve">33</w:t>
         </w:r>
       </w:hyperlink>
-      <w:hyperlink r:id="rId58">
+      <w:hyperlink r:id="rId68">
         <w:r>
           <w:rPr>
             <w:color w:val="B31822"/>
@@ -2005,7 +2191,7 @@
           <w:t xml:space="preserve">23</w:t>
         </w:r>
       </w:hyperlink>
-      <w:hyperlink r:id="rId29">
+      <w:hyperlink r:id="rId40">
         <w:r>
           <w:rPr>
             <w:color w:val="B31822"/>
@@ -2069,7 +2255,7 @@
           <w:sz w:val="20"/>
         </w:rPr>
       </w:r>
-      <w:hyperlink r:id="rId44">
+      <w:hyperlink r:id="rId55">
         <w:r>
           <w:rPr>
             <w:color w:val="B31822"/>
@@ -2102,7 +2288,7 @@
         </w:rPr>
         <w:t>KKR agreed to buy Medicover India's 24 hospitals; closing expected fourth quarter 2026.</w:t>
       </w:r>
-      <w:hyperlink r:id="rId42">
+      <w:hyperlink r:id="rId53">
         <w:r>
           <w:rPr>
             <w:color w:val="B31822"/>
@@ -2116,7 +2302,7 @@
           <w:sz w:val="20"/>
         </w:rPr>
       </w:r>
-      <w:hyperlink r:id="rId51">
+      <w:hyperlink r:id="rId62">
         <w:r>
           <w:rPr>
             <w:color w:val="B31822"/>
@@ -2163,7 +2349,7 @@
           <w:sz w:val="20"/>
         </w:rPr>
       </w:r>
-      <w:hyperlink r:id="rId59">
+      <w:hyperlink r:id="rId69">
         <w:r>
           <w:rPr>
             <w:color w:val="B31822"/>

</xml_diff>

<commit_message>
Summary: separate adjacent citation numbers with commas
Co-Authored-By: Claude Opus 5.5 <noreply@anthropic.com>
Claude-Session: https://claude.ai/code/session_01ChEN58PbdXFZmwUoBZYBRb
</commit_message>
<xml_diff>
--- a/output/India_Summary_DRAFT.docx
+++ b/output/India_Summary_DRAFT.docx
@@ -465,7 +465,7 @@
             <w:color w:val="B31822"/>
             <w:vertAlign w:val="superscript"/>
           </w:rPr>
-          <w:t xml:space="preserve">3</w:t>
+          <w:t xml:space="preserve">3,</w:t>
         </w:r>
       </w:hyperlink>
       <w:hyperlink r:id="rId19">
@@ -474,7 +474,7 @@
             <w:color w:val="B31822"/>
             <w:vertAlign w:val="superscript"/>
           </w:rPr>
-          <w:t xml:space="preserve">1</w:t>
+          <w:t xml:space="preserve">1,</w:t>
         </w:r>
       </w:hyperlink>
       <w:hyperlink r:id="rId20">
@@ -498,7 +498,7 @@
             <w:color w:val="B31822"/>
             <w:vertAlign w:val="superscript"/>
           </w:rPr>
-          <w:t xml:space="preserve">8</w:t>
+          <w:t xml:space="preserve">8,</w:t>
         </w:r>
       </w:hyperlink>
       <w:hyperlink r:id="rId22">
@@ -522,7 +522,7 @@
             <w:color w:val="B31822"/>
             <w:vertAlign w:val="superscript"/>
           </w:rPr>
-          <w:t xml:space="preserve">2</w:t>
+          <w:t xml:space="preserve">2,</w:t>
         </w:r>
       </w:hyperlink>
       <w:hyperlink r:id="rId23">
@@ -546,7 +546,7 @@
             <w:color w:val="B31822"/>
             <w:vertAlign w:val="superscript"/>
           </w:rPr>
-          <w:t xml:space="preserve">25</w:t>
+          <w:t xml:space="preserve">25,</w:t>
         </w:r>
       </w:hyperlink>
       <w:hyperlink r:id="rId25">
@@ -555,7 +555,7 @@
             <w:color w:val="B31822"/>
             <w:vertAlign w:val="superscript"/>
           </w:rPr>
-          <w:t xml:space="preserve">26</w:t>
+          <w:t xml:space="preserve">26,</w:t>
         </w:r>
       </w:hyperlink>
       <w:hyperlink r:id="rId26">
@@ -579,7 +579,7 @@
             <w:color w:val="B31822"/>
             <w:vertAlign w:val="superscript"/>
           </w:rPr>
-          <w:t xml:space="preserve">12</w:t>
+          <w:t xml:space="preserve">12,</w:t>
         </w:r>
       </w:hyperlink>
       <w:hyperlink r:id="rId28">
@@ -588,7 +588,7 @@
             <w:color w:val="B31822"/>
             <w:vertAlign w:val="superscript"/>
           </w:rPr>
-          <w:t xml:space="preserve">15</w:t>
+          <w:t xml:space="preserve">15,</w:t>
         </w:r>
       </w:hyperlink>
       <w:hyperlink r:id="rId29">
@@ -612,7 +612,7 @@
             <w:color w:val="B31822"/>
             <w:vertAlign w:val="superscript"/>
           </w:rPr>
-          <w:t xml:space="preserve">29</w:t>
+          <w:t xml:space="preserve">29,</w:t>
         </w:r>
       </w:hyperlink>
       <w:hyperlink r:id="rId31">
@@ -655,7 +655,7 @@
             <w:color w:val="B31822"/>
             <w:vertAlign w:val="superscript"/>
           </w:rPr>
-          <w:t xml:space="preserve">59</w:t>
+          <w:t xml:space="preserve">59,</w:t>
         </w:r>
       </w:hyperlink>
       <w:hyperlink r:id="rId16">
@@ -685,7 +685,7 @@
             <w:color w:val="B31822"/>
             <w:vertAlign w:val="superscript"/>
           </w:rPr>
-          <w:t xml:space="preserve">122</w:t>
+          <w:t xml:space="preserve">122,</w:t>
         </w:r>
       </w:hyperlink>
       <w:hyperlink r:id="rId34">
@@ -715,7 +715,7 @@
             <w:color w:val="B31822"/>
             <w:vertAlign w:val="superscript"/>
           </w:rPr>
-          <w:t xml:space="preserve">72</w:t>
+          <w:t xml:space="preserve">72,</w:t>
         </w:r>
       </w:hyperlink>
       <w:hyperlink r:id="rId23">
@@ -745,7 +745,7 @@
             <w:color w:val="B31822"/>
             <w:vertAlign w:val="superscript"/>
           </w:rPr>
-          <w:t xml:space="preserve">80</w:t>
+          <w:t xml:space="preserve">80,</w:t>
         </w:r>
       </w:hyperlink>
       <w:hyperlink r:id="rId36">
@@ -797,7 +797,7 @@
             <w:color w:val="B31822"/>
             <w:vertAlign w:val="superscript"/>
           </w:rPr>
-          <w:t xml:space="preserve">2</w:t>
+          <w:t xml:space="preserve">2,</w:t>
         </w:r>
       </w:hyperlink>
       <w:hyperlink r:id="rId37">
@@ -827,7 +827,7 @@
             <w:color w:val="B31822"/>
             <w:vertAlign w:val="superscript"/>
           </w:rPr>
-          <w:t xml:space="preserve">23</w:t>
+          <w:t xml:space="preserve">23,</w:t>
         </w:r>
       </w:hyperlink>
       <w:hyperlink r:id="rId38">
@@ -857,7 +857,7 @@
             <w:color w:val="B31822"/>
             <w:vertAlign w:val="superscript"/>
           </w:rPr>
-          <w:t xml:space="preserve">80</w:t>
+          <w:t xml:space="preserve">80,</w:t>
         </w:r>
       </w:hyperlink>
       <w:hyperlink r:id="rId39">
@@ -866,7 +866,7 @@
             <w:color w:val="B31822"/>
             <w:vertAlign w:val="superscript"/>
           </w:rPr>
-          <w:t xml:space="preserve">55</w:t>
+          <w:t xml:space="preserve">55,</w:t>
         </w:r>
       </w:hyperlink>
       <w:hyperlink r:id="rId40">
@@ -1128,7 +1128,7 @@
             <w:color w:val="B31822"/>
             <w:vertAlign w:val="superscript"/>
           </w:rPr>
-          <w:t xml:space="preserve">62</w:t>
+          <w:t xml:space="preserve">62,</w:t>
         </w:r>
       </w:hyperlink>
       <w:hyperlink r:id="rId49">
@@ -1137,7 +1137,7 @@
             <w:color w:val="B31822"/>
             <w:vertAlign w:val="superscript"/>
           </w:rPr>
-          <w:t xml:space="preserve">64</w:t>
+          <w:t xml:space="preserve">64,</w:t>
         </w:r>
       </w:hyperlink>
       <w:hyperlink r:id="rId50">
@@ -1167,7 +1167,7 @@
             <w:color w:val="B31822"/>
             <w:vertAlign w:val="superscript"/>
           </w:rPr>
-          <w:t xml:space="preserve">63</w:t>
+          <w:t xml:space="preserve">63,</w:t>
         </w:r>
       </w:hyperlink>
       <w:hyperlink r:id="rId52">
@@ -1176,7 +1176,7 @@
             <w:color w:val="B31822"/>
             <w:vertAlign w:val="superscript"/>
           </w:rPr>
-          <w:t xml:space="preserve">66</w:t>
+          <w:t xml:space="preserve">66,</w:t>
         </w:r>
       </w:hyperlink>
       <w:hyperlink r:id="rId53">
@@ -1185,7 +1185,7 @@
             <w:color w:val="B31822"/>
             <w:vertAlign w:val="superscript"/>
           </w:rPr>
-          <w:t xml:space="preserve">74</w:t>
+          <w:t xml:space="preserve">74,</w:t>
         </w:r>
       </w:hyperlink>
       <w:hyperlink r:id="rId54">
@@ -1215,7 +1215,7 @@
             <w:color w:val="B31822"/>
             <w:vertAlign w:val="superscript"/>
           </w:rPr>
-          <w:t xml:space="preserve">103</w:t>
+          <w:t xml:space="preserve">103,</w:t>
         </w:r>
       </w:hyperlink>
       <w:hyperlink r:id="rId56">
@@ -2016,7 +2016,7 @@
             <w:color w:val="B31822"/>
             <w:vertAlign w:val="superscript"/>
           </w:rPr>
-          <w:t xml:space="preserve">83</w:t>
+          <w:t xml:space="preserve">83,</w:t>
         </w:r>
       </w:hyperlink>
       <w:hyperlink r:id="rId63">
@@ -2046,7 +2046,7 @@
             <w:color w:val="B31822"/>
             <w:vertAlign w:val="superscript"/>
           </w:rPr>
-          <w:t xml:space="preserve">62</w:t>
+          <w:t xml:space="preserve">62,</w:t>
         </w:r>
       </w:hyperlink>
       <w:hyperlink r:id="rId35">
@@ -2076,7 +2076,7 @@
             <w:color w:val="B31822"/>
             <w:vertAlign w:val="superscript"/>
           </w:rPr>
-          <w:t xml:space="preserve">15</w:t>
+          <w:t xml:space="preserve">15,</w:t>
         </w:r>
       </w:hyperlink>
       <w:hyperlink r:id="rId64">
@@ -2085,7 +2085,7 @@
             <w:color w:val="B31822"/>
             <w:vertAlign w:val="superscript"/>
           </w:rPr>
-          <w:t xml:space="preserve">37</w:t>
+          <w:t xml:space="preserve">37,</w:t>
         </w:r>
       </w:hyperlink>
       <w:hyperlink r:id="rId65">
@@ -2128,7 +2128,7 @@
             <w:color w:val="B31822"/>
             <w:vertAlign w:val="superscript"/>
           </w:rPr>
-          <w:t xml:space="preserve">104</w:t>
+          <w:t xml:space="preserve">104,</w:t>
         </w:r>
       </w:hyperlink>
       <w:hyperlink r:id="rId66">
@@ -2158,7 +2158,7 @@
             <w:color w:val="B31822"/>
             <w:vertAlign w:val="superscript"/>
           </w:rPr>
-          <w:t xml:space="preserve">33</w:t>
+          <w:t xml:space="preserve">33,</w:t>
         </w:r>
       </w:hyperlink>
       <w:hyperlink r:id="rId68">
@@ -2188,7 +2188,7 @@
             <w:color w:val="B31822"/>
             <w:vertAlign w:val="superscript"/>
           </w:rPr>
-          <w:t xml:space="preserve">23</w:t>
+          <w:t xml:space="preserve">23,</w:t>
         </w:r>
       </w:hyperlink>
       <w:hyperlink r:id="rId40">
@@ -2197,7 +2197,7 @@
             <w:color w:val="B31822"/>
             <w:vertAlign w:val="superscript"/>
           </w:rPr>
-          <w:t xml:space="preserve">89</w:t>
+          <w:t xml:space="preserve">89,</w:t>
         </w:r>
       </w:hyperlink>
       <w:hyperlink r:id="rId16">
@@ -2247,14 +2247,9 @@
             <w:color w:val="B31822"/>
             <w:vertAlign w:val="superscript"/>
           </w:rPr>
-          <w:t xml:space="preserve">24</w:t>
+          <w:t xml:space="preserve">24,</w:t>
         </w:r>
       </w:hyperlink>
-      <w:r>
-        <w:rPr>
-          <w:sz w:val="20"/>
-        </w:rPr>
-      </w:r>
       <w:hyperlink r:id="rId55">
         <w:r>
           <w:rPr>
@@ -2264,11 +2259,6 @@
           <w:t xml:space="preserve">103</w:t>
         </w:r>
       </w:hyperlink>
-      <w:r>
-        <w:rPr>
-          <w:sz w:val="20"/>
-        </w:rPr>
-      </w:r>
     </w:p>
     <w:p>
       <w:pPr>
@@ -2294,14 +2284,9 @@
             <w:color w:val="B31822"/>
             <w:vertAlign w:val="superscript"/>
           </w:rPr>
-          <w:t xml:space="preserve">74</w:t>
+          <w:t xml:space="preserve">74,</w:t>
         </w:r>
       </w:hyperlink>
-      <w:r>
-        <w:rPr>
-          <w:sz w:val="20"/>
-        </w:rPr>
-      </w:r>
       <w:hyperlink r:id="rId62">
         <w:r>
           <w:rPr>
@@ -2311,11 +2296,6 @@
           <w:t xml:space="preserve">137</w:t>
         </w:r>
       </w:hyperlink>
-      <w:r>
-        <w:rPr>
-          <w:sz w:val="20"/>
-        </w:rPr>
-      </w:r>
     </w:p>
     <w:p>
       <w:pPr>
@@ -2341,14 +2321,9 @@
             <w:color w:val="B31822"/>
             <w:vertAlign w:val="superscript"/>
           </w:rPr>
-          <w:t xml:space="preserve">56</w:t>
+          <w:t xml:space="preserve">56,</w:t>
         </w:r>
       </w:hyperlink>
-      <w:r>
-        <w:rPr>
-          <w:sz w:val="20"/>
-        </w:rPr>
-      </w:r>
       <w:hyperlink r:id="rId69">
         <w:r>
           <w:rPr>
@@ -2358,11 +2333,6 @@
           <w:t xml:space="preserve">57</w:t>
         </w:r>
       </w:hyperlink>
-      <w:r>
-        <w:rPr>
-          <w:sz w:val="20"/>
-        </w:rPr>
-      </w:r>
     </w:p>
     <w:sectPr>
       <w:footerReference w:type="default" r:id="rId9"/>

</xml_diff>